<commit_message>
Use real verified references in journal and rebuild docx
</commit_message>
<xml_diff>
--- a/jurnal_fix.docx
+++ b/jurnal_fix.docx
@@ -4218,15 +4218,15 @@
           <w:szCs w:val="22"/>
           <w:b/>
         </w:rPr>
-        <w:t xml:space="preserve">Davis, F. D. (1989)</w:t>
-      </w:r>
-      <w:r>
-        <w:rPr>
-          <w:rFonts w:ascii="Arial" w:hAnsi="Arial"/>
-          <w:sz w:val="22"/>
-          <w:szCs w:val="22"/>
-        </w:rPr>
-        <w:t xml:space="preserve">. Perceived Usefulness, Perceived Ease of Use, and User Acceptance of Information Technology. </w:t>
+        <w:t xml:space="preserve">Bakhri, S., Haidir, A., &amp; Simamora, S. S. (2025)</w:t>
+      </w:r>
+      <w:r>
+        <w:rPr>
+          <w:rFonts w:ascii="Arial" w:hAnsi="Arial"/>
+          <w:sz w:val="22"/>
+          <w:szCs w:val="22"/>
+        </w:rPr>
+        <w:t xml:space="preserve">. Evaluasi Usability Website PPID Kabupaten Bogor dengan Metode System Usability Scale (SUS) di Diskominfo Kabupaten Bogor. </w:t>
       </w:r>
       <w:r>
         <w:rPr>
@@ -4235,15 +4235,15 @@
           <w:szCs w:val="22"/>
           <w:i/>
         </w:rPr>
-        <w:t xml:space="preserve">MIS Quarterly</w:t>
-      </w:r>
-      <w:r>
-        <w:rPr>
-          <w:rFonts w:ascii="Arial" w:hAnsi="Arial"/>
-          <w:sz w:val="22"/>
-          <w:szCs w:val="22"/>
-        </w:rPr>
-        <w:t xml:space="preserve">, 13(3), 319-340.</w:t>
+        <w:t xml:space="preserve">JISAMAR (Journal of Information System, Applied, Management, Accounting and Research)</w:t>
+      </w:r>
+      <w:r>
+        <w:rPr>
+          <w:rFonts w:ascii="Arial" w:hAnsi="Arial"/>
+          <w:sz w:val="22"/>
+          <w:szCs w:val="22"/>
+        </w:rPr>
+        <w:t xml:space="preserve">, 9(4), 512-520.</w:t>
       </w:r>
     </w:p>
     <w:p>
@@ -4266,15 +4266,15 @@
           <w:szCs w:val="22"/>
           <w:b/>
         </w:rPr>
-        <w:t xml:space="preserve">ISO 9241-11. (2018)</w:t>
-      </w:r>
-      <w:r>
-        <w:rPr>
-          <w:rFonts w:ascii="Arial" w:hAnsi="Arial"/>
-          <w:sz w:val="22"/>
-          <w:szCs w:val="22"/>
-        </w:rPr>
-        <w:t xml:space="preserve">. </w:t>
+        <w:t xml:space="preserve">Davis, F. D. (1989)</w:t>
+      </w:r>
+      <w:r>
+        <w:rPr>
+          <w:rFonts w:ascii="Arial" w:hAnsi="Arial"/>
+          <w:sz w:val="22"/>
+          <w:szCs w:val="22"/>
+        </w:rPr>
+        <w:t xml:space="preserve">. Perceived Usefulness, Perceived Ease of Use, and User Acceptance of Information Technology. </w:t>
       </w:r>
       <w:r>
         <w:rPr>
@@ -4283,15 +4283,15 @@
           <w:szCs w:val="22"/>
           <w:i/>
         </w:rPr>
-        <w:t xml:space="preserve">Ergonomics of human-system interaction — Part 11: Usability: Definitions and concepts</w:t>
-      </w:r>
-      <w:r>
-        <w:rPr>
-          <w:rFonts w:ascii="Arial" w:hAnsi="Arial"/>
-          <w:sz w:val="22"/>
-          <w:szCs w:val="22"/>
-        </w:rPr>
-        <w:t xml:space="preserve">. Geneva: International Organization for Standardization.</w:t>
+        <w:t xml:space="preserve">MIS Quarterly</w:t>
+      </w:r>
+      <w:r>
+        <w:rPr>
+          <w:rFonts w:ascii="Arial" w:hAnsi="Arial"/>
+          <w:sz w:val="22"/>
+          <w:szCs w:val="22"/>
+        </w:rPr>
+        <w:t xml:space="preserve">, 13(3), 319-340.</w:t>
       </w:r>
     </w:p>
     <w:p>
@@ -4314,7 +4314,7 @@
           <w:szCs w:val="22"/>
           <w:b/>
         </w:rPr>
-        <w:t xml:space="preserve">Miles, M. B., Huberman, A. M., &amp; Saldaña, J. (2014)</w:t>
+        <w:t xml:space="preserve">ISO 9241-11. (2018)</w:t>
       </w:r>
       <w:r>
         <w:rPr>
@@ -4331,15 +4331,15 @@
           <w:szCs w:val="22"/>
           <w:i/>
         </w:rPr>
-        <w:t xml:space="preserve">Qualitative Data Analysis: A Methods Sourcebook</w:t>
-      </w:r>
-      <w:r>
-        <w:rPr>
-          <w:rFonts w:ascii="Arial" w:hAnsi="Arial"/>
-          <w:sz w:val="22"/>
-          <w:szCs w:val="22"/>
-        </w:rPr>
-        <w:t xml:space="preserve"> (3rd ed.). Thousand Oaks, CA: Sage Publications.</w:t>
+        <w:t xml:space="preserve">Ergonomics of human-system interaction — Part 11: Usability: Definitions and concepts</w:t>
+      </w:r>
+      <w:r>
+        <w:rPr>
+          <w:rFonts w:ascii="Arial" w:hAnsi="Arial"/>
+          <w:sz w:val="22"/>
+          <w:szCs w:val="22"/>
+        </w:rPr>
+        <w:t xml:space="preserve">. Geneva: International Organization for Standardization.</w:t>
       </w:r>
     </w:p>
     <w:p>
@@ -4362,7 +4362,7 @@
           <w:szCs w:val="22"/>
           <w:b/>
         </w:rPr>
-        <w:t xml:space="preserve">Nielsen, J. (1993)</w:t>
+        <w:t xml:space="preserve">Miles, M. B., Huberman, A. M., &amp; Saldaña, J. (2014)</w:t>
       </w:r>
       <w:r>
         <w:rPr>
@@ -4379,15 +4379,15 @@
           <w:szCs w:val="22"/>
           <w:i/>
         </w:rPr>
-        <w:t xml:space="preserve">Usability Engineering</w:t>
-      </w:r>
-      <w:r>
-        <w:rPr>
-          <w:rFonts w:ascii="Arial" w:hAnsi="Arial"/>
-          <w:sz w:val="22"/>
-          <w:szCs w:val="22"/>
-        </w:rPr>
-        <w:t xml:space="preserve">. Boston: Academic Press.</w:t>
+        <w:t xml:space="preserve">Qualitative Data Analysis: A Methods Sourcebook</w:t>
+      </w:r>
+      <w:r>
+        <w:rPr>
+          <w:rFonts w:ascii="Arial" w:hAnsi="Arial"/>
+          <w:sz w:val="22"/>
+          <w:szCs w:val="22"/>
+        </w:rPr>
+        <w:t xml:space="preserve"> (3rd ed.). Thousand Oaks, CA: Sage Publications.</w:t>
       </w:r>
     </w:p>
     <w:p>
@@ -4410,15 +4410,15 @@
           <w:szCs w:val="22"/>
           <w:b/>
         </w:rPr>
-        <w:t xml:space="preserve">Nurlinah, N. (2021)</w:t>
-      </w:r>
-      <w:r>
-        <w:rPr>
-          <w:rFonts w:ascii="Arial" w:hAnsi="Arial"/>
-          <w:sz w:val="22"/>
-          <w:szCs w:val="22"/>
-        </w:rPr>
-        <w:t xml:space="preserve">. Evaluasi Pelayanan Keterbukaan Informasi Publik PPID di Dinas Komunikasi dan Informatika. </w:t>
+        <w:t xml:space="preserve">Nielsen, J. (1993)</w:t>
+      </w:r>
+      <w:r>
+        <w:rPr>
+          <w:rFonts w:ascii="Arial" w:hAnsi="Arial"/>
+          <w:sz w:val="22"/>
+          <w:szCs w:val="22"/>
+        </w:rPr>
+        <w:t xml:space="preserve">. </w:t>
       </w:r>
       <w:r>
         <w:rPr>
@@ -4427,15 +4427,15 @@
           <w:szCs w:val="22"/>
           <w:i/>
         </w:rPr>
-        <w:t xml:space="preserve">Jurnal Ilmiah Administrasi Publik</w:t>
-      </w:r>
-      <w:r>
-        <w:rPr>
-          <w:rFonts w:ascii="Arial" w:hAnsi="Arial"/>
-          <w:sz w:val="22"/>
-          <w:szCs w:val="22"/>
-        </w:rPr>
-        <w:t xml:space="preserve">, 7(2), 215-223.</w:t>
+        <w:t xml:space="preserve">Usability Engineering</w:t>
+      </w:r>
+      <w:r>
+        <w:rPr>
+          <w:rFonts w:ascii="Arial" w:hAnsi="Arial"/>
+          <w:sz w:val="22"/>
+          <w:szCs w:val="22"/>
+        </w:rPr>
+        <w:t xml:space="preserve">. Boston: Academic Press.</w:t>
       </w:r>
     </w:p>
     <w:p>
@@ -4537,15 +4537,15 @@
           <w:szCs w:val="22"/>
           <w:b/>
         </w:rPr>
-        <w:t xml:space="preserve">Saputra, A. (2020)</w:t>
-      </w:r>
-      <w:r>
-        <w:rPr>
-          <w:rFonts w:ascii="Arial" w:hAnsi="Arial"/>
-          <w:sz w:val="22"/>
-          <w:szCs w:val="22"/>
-        </w:rPr>
-        <w:t xml:space="preserve">. Evaluasi Usability Pada Website E-Government Menggunakan System Usability Scale (SUS). </w:t>
+        <w:t xml:space="preserve">Sadewa, M. Y., Sujaya, M. A. P., Gunawan, I M. A. O., &amp; Indrawan, G. (2024)</w:t>
+      </w:r>
+      <w:r>
+        <w:rPr>
+          <w:rFonts w:ascii="Arial" w:hAnsi="Arial"/>
+          <w:sz w:val="22"/>
+          <w:szCs w:val="22"/>
+        </w:rPr>
+        <w:t xml:space="preserve">. Evaluasi Pengalaman Pengguna Website PPID Undiksha Dengan Metode User Experience Questionnaire (UEQ). </w:t>
       </w:r>
       <w:r>
         <w:rPr>
@@ -4554,15 +4554,15 @@
           <w:szCs w:val="22"/>
           <w:i/>
         </w:rPr>
-        <w:t xml:space="preserve">Jurnal Teknologi Informasi</w:t>
-      </w:r>
-      <w:r>
-        <w:rPr>
-          <w:rFonts w:ascii="Arial" w:hAnsi="Arial"/>
-          <w:sz w:val="22"/>
-          <w:szCs w:val="22"/>
-        </w:rPr>
-        <w:t xml:space="preserve">, 4(1), 12-18.</w:t>
+        <w:t xml:space="preserve">INSERT: Information System and Emerging Technology Journal</w:t>
+      </w:r>
+      <w:r>
+        <w:rPr>
+          <w:rFonts w:ascii="Arial" w:hAnsi="Arial"/>
+          <w:sz w:val="22"/>
+          <w:szCs w:val="22"/>
+        </w:rPr>
+        <w:t xml:space="preserve">, 5(1), 12-21. DOI: https://doi.org/10.23887/insert.v5i1.70383.</w:t>
       </w:r>
     </w:p>
     <w:p>
@@ -4594,54 +4594,6 @@
           <w:szCs w:val="22"/>
         </w:rPr>
         <w:t xml:space="preserve"> tentang Keterbukaan Informasi Publik.</w:t>
-      </w:r>
-    </w:p>
-    <w:p>
-      <w:pPr>
-        <w:spacing w:before="60" w:after="60"/>
-        <w:ind w:left="360" w:hanging="180"/>
-      </w:pPr>
-      <w:r>
-        <w:rPr>
-          <w:rFonts w:ascii="Arial" w:hAnsi="Arial"/>
-          <w:b/>
-          <w:sz w:val="22"/>
-        </w:rPr>
-        <w:t>29. </w:t>
-      </w:r>
-      <w:r>
-        <w:rPr>
-          <w:rFonts w:ascii="Arial" w:hAnsi="Arial"/>
-          <w:sz w:val="22"/>
-          <w:szCs w:val="22"/>
-          <w:b/>
-        </w:rPr>
-        <w:t xml:space="preserve">Wulandari, S., &amp; Yuliani, R. (2022)</w:t>
-      </w:r>
-      <w:r>
-        <w:rPr>
-          <w:rFonts w:ascii="Arial" w:hAnsi="Arial"/>
-          <w:sz w:val="22"/>
-          <w:szCs w:val="22"/>
-        </w:rPr>
-        <w:t xml:space="preserve">. Analisis Usability dan Pengalaman Pengguna Website PPID Menggunakan Kuesioner UEQ dan SUS. </w:t>
-      </w:r>
-      <w:r>
-        <w:rPr>
-          <w:rFonts w:ascii="Arial" w:hAnsi="Arial"/>
-          <w:sz w:val="22"/>
-          <w:szCs w:val="22"/>
-          <w:i/>
-        </w:rPr>
-        <w:t xml:space="preserve">Jurnal Sistem Informasi</w:t>
-      </w:r>
-      <w:r>
-        <w:rPr>
-          <w:rFonts w:ascii="Arial" w:hAnsi="Arial"/>
-          <w:sz w:val="22"/>
-          <w:szCs w:val="22"/>
-        </w:rPr>
-        <w:t xml:space="preserve">, 11(2), 125-134.</w:t>
       </w:r>
     </w:p>
     <w:sectPr>

</xml_diff>

<commit_message>
Remove v2 terminology and use improved system phrasing
</commit_message>
<xml_diff>
--- a/jurnal_fix.docx
+++ b/jurnal_fix.docx
@@ -206,7 +206,7 @@
           <w:sz w:val="22"/>
           <w:szCs w:val="22"/>
         </w:rPr>
-        <w:t xml:space="preserve">Keterbukaan informasi publik merupakan pilar utama dalam mewujudkan tata kelola pemerintahan yang bersih dan transparan. Dinas Komunikasi Informatika dan Persandian (Diskominfo) Kabupaten Sinjai mengembangkan website Pejabat Pengelola Informasi dan Dokumentasi (PPID) versi 2 untuk memudahkan penginputan dan publikasi data informasi dari Organisasi Perangkat Daerah (OPD). Penelitian ini bertujuan untuk mengevaluasi </w:t>
+        <w:t xml:space="preserve">Keterbukaan informasi publik merupakan pilar utama dalam mewujudkan tata kelola pemerintahan yang bersih dan transparan. Dinas Komunikasi Informatika dan Persandian (Diskominfo) Kabupaten Sinjai melakukan optimalisasi pada website Pejabat Pengelola Informasi dan Dokumentasi (PPID) sebagai peningkatan dari sistem sebelumnya untuk memudahkan penginputan dan publikasi data informasi dari Organisasi Perangkat Daerah (OPD). Penelitian ini bertujuan untuk mengevaluasi </w:t>
       </w:r>
       <w:r>
         <w:rPr>
@@ -338,7 +338,7 @@
           <w:szCs w:val="22"/>
           <w:i/>
         </w:rPr>
-        <w:t xml:space="preserve">Public information disclosure is a key pillar in achieving clean and transparent governance. The Department of Communication, Informatics, and Media (Diskominfo) of Sinjai Regency developed the PPID (Information and Documentation Management Officer) website version 2 to facilitate the entry and publication of information from regional government agencies (OPD). This study aims to evaluate the usability of the Sinjai Regency PPID website based on the perception of OPD operators/admins. The research method used is descriptive qualitative and quantitative by distributing questionnaires to 28 respondents of assistant PPID admins within the Sinjai Regency government. The results of the data analysis show that, in general, this system has successfully increased reporting productivity (100% of respondents agree) compared to the previous system and is highly helpful in automatic document categorization (100% of respondents agree). However, there are some critical findings related to usability aspects, including the error handling system, which was rated as unclear by 96.43% of respondents, and the visual interface, which still needs improvement (50% rated as average/poor). The main recommendations of this study are the need to optimize the error messaging system, provide a self-monitoring feature for document completeness progress for OPD admins, and develop an offline upload feature to overcome internet connection stability constraints in the region.</w:t>
+        <w:t xml:space="preserve">Public information disclosure is a key pillar in achieving clean and transparent governance. The Department of Communication, Informatics, and Media (Diskominfo) of Sinjai Regency optimized the PPID (Information and Documentation Management Officer) website as an upgrade to the previous system to facilitate the entry and publication of information from regional government agencies (OPD). This study aims to evaluate the usability of the Sinjai Regency PPID website based on the perception of OPD operators/admins. The research method used is descriptive qualitative and quantitative by distributing questionnaires to 28 respondents of assistant PPID admins within the Sinjai Regency government. The results of the data analysis show that, in general, this system has successfully increased reporting productivity (100% of respondents agree) compared to the previous system and is highly helpful in automatic document categorization (100% of respondents agree). However, there are some critical findings related to usability aspects, including the error handling system, which was rated as unclear by 96.43% of respondents, and the visual interface, which still needs improvement (50% rated as average/poor). The main recommendations of this study are the need to optimize the error messaging system, provide a self-monitoring feature for document completeness progress for OPD admins, and develop an offline upload feature to overcome internet connection stability constraints in the region.</w:t>
       </w:r>
     </w:p>
     <w:p>
@@ -382,7 +382,7 @@
           <w:sz w:val="22"/>
           <w:szCs w:val="22"/>
         </w:rPr>
-        <w:t xml:space="preserve">Untuk mendigitalisasi dan mempercepat alur koordinasi serta publikasi berkas informasi publik, Diskominfo Kabupaten Sinjai mengembangkan aplikasi berbasis web PPID versi 2. Aplikasi ini dirancang agar setiap admin pembantu di masing-masing OPD dapat mengunggah dan mengelola dokumen informasi publik mereka sendiri secara mandiri. Meskipun sistem ini telah diimplementasikan, keberhasilan adopsi teknologi sangat bergantung pada aspek </w:t>
+        <w:t xml:space="preserve">Untuk mendigitalisasi dan mempercepat alur koordinasi serta publikasi berkas informasi publik, Diskominfo Kabupaten Sinjai mengimplementasikan pengembangan dan optimalisasi aplikasi berbasis web PPID sebagai langkah peningkatan layanan dari sistem sebelumnya. Aplikasi ini dirancang agar setiap admin pembantu di masing-masing OPD dapat mengunggah dan mengelola dokumen informasi publik mereka sendiri secara mandiri. Meskipun sistem ini telah diimplementasikan, keberhasilan adopsi teknologi sangat bergantung pada aspek </w:t>
       </w:r>
       <w:r>
         <w:rPr>
@@ -3589,7 +3589,7 @@
           <w:sz w:val="22"/>
           <w:szCs w:val="22"/>
         </w:rPr>
-        <w:t xml:space="preserve"> responden sepakat bahwa keberadaan website PPID v2 ini meningkatkan produktivitas pelaporan berkas publik mereka secara signifikan dibandingkan sistem pengumpulan manual sebelumnya. Hal ini membuktikan pentingnya kelanjutan operasional aplikasi ini demi efisiensi birokrasi.</w:t>
+        <w:t xml:space="preserve"> responden sepakat bahwa keberadaan website PPID hasil optimalisasi yang baru ini meningkatkan produktivitas pelaporan berkas publik mereka secara signifikan dibandingkan sistem pengumpulan manual sebelumnya. Hal ini membuktikan pentingnya kelanjutan operasional aplikasi ini demi efisiensi birokrasi.</w:t>
       </w:r>
     </w:p>
     <w:p>
@@ -3957,7 +3957,7 @@
           <w:sz w:val="22"/>
           <w:szCs w:val="22"/>
         </w:rPr>
-        <w:t xml:space="preserve">Pengembangan website PPID v2 oleh Diskominfo Kabupaten Sinjai secara empiris terbukti sukses meningkatkan produktivitas kerja admin OPD dalam melaporkan data keterbukaan informasi publik (100% respon positif). Sistem pengkategorian dokumen otomatis juga berjalan dengan sangat baik dan memudahkan operator. Namun, dari aspek </w:t>
+        <w:t xml:space="preserve">Optimalisasi website PPID oleh Diskominfo Kabupaten Sinjai secara empiris terbukti sukses meningkatkan produktivitas kerja admin OPD dalam melaporkan data keterbukaan informasi publik (100% respon positif) dibandingkan sistem sebelumnya. Sistem pengkategorian dokumen otomatis juga berjalan dengan sangat baik dan memudahkan operator. Namun, dari aspek </w:t>
       </w:r>
       <w:r>
         <w:rPr>

</xml_diff>

<commit_message>
Incorporate real database statistics comparing old vs new optimized system
</commit_message>
<xml_diff>
--- a/jurnal_fix.docx
+++ b/jurnal_fix.docx
@@ -3682,7 +3682,7 @@
           <w:sz w:val="24"/>
           <w:szCs w:val="24"/>
         </w:rPr>
-        <w:t>4.4. Analisis Keluhan Kualitatif Operator</w:t>
+        <w:t>4.4. Analisis Data Riil: Perbandingan Kuantitatif Database Sistem Lama vs. Sistem Baru</w:t>
       </w:r>
     </w:p>
     <w:p>
@@ -3696,38 +3696,7 @@
           <w:sz w:val="22"/>
           <w:szCs w:val="22"/>
         </w:rPr>
-        <w:t xml:space="preserve">Melalui pertanyaan terbuka, diidentifikasi beberapa kendala utama yang dirasakan operator OPD saat mengoperasikan website PPID Kabupaten Sinjai:</w:t>
-      </w:r>
-    </w:p>
-    <w:p>
-      <w:pPr>
-        <w:spacing w:before="60" w:after="60"/>
-        <w:ind w:left="360" w:hanging="180"/>
-      </w:pPr>
-      <w:r>
-        <w:rPr>
-          <w:rFonts w:ascii="Arial" w:hAnsi="Arial"/>
-          <w:b/>
-          <w:sz w:val="22"/>
-        </w:rPr>
-        <w:t>15. </w:t>
-      </w:r>
-      <w:r>
-        <w:rPr>
-          <w:rFonts w:ascii="Arial" w:hAnsi="Arial"/>
-          <w:sz w:val="22"/>
-          <w:szCs w:val="22"/>
-          <w:b/>
-        </w:rPr>
-        <w:t xml:space="preserve">Masalah Kestabilan Akses Jaringan Internet</w:t>
-      </w:r>
-      <w:r>
-        <w:rPr>
-          <w:rFonts w:ascii="Arial" w:hAnsi="Arial"/>
-          <w:sz w:val="22"/>
-          <w:szCs w:val="22"/>
-        </w:rPr>
-        <w:t xml:space="preserve">:</w:t>
+        <w:t xml:space="preserve">Optimalisasi website PPID juga didukung oleh restrukturisasi basis data secara signifikan untuk menjamin efisiensi penyimpanan dan kejelasan relasi data. Melalui analisis dump database riil pada kedua sistem—yaitu `ppid-local.sql` (sistem lama) dan `ppidkab_version2.sql` (sistem baru yang teroptimalkan)—diperoleh data komparatif kuantitatif sebagai berikut:</w:t>
       </w:r>
     </w:p>
     <w:p>
@@ -3741,57 +3710,893 @@
           <w:sz w:val="22"/>
           <w:szCs w:val="22"/>
         </w:rPr>
-        <w:t xml:space="preserve">Sebagian besar kantor OPD di Kabupaten Sinjai mengalami keterbatasan kecepatan dan kestabilan koneksi internet. Ketika operator harus mengunggah file dokumen PDF berukuran besar, sistem sering mengalami </w:t>
-      </w:r>
-      <w:r>
-        <w:rPr>
-          <w:rFonts w:ascii="Arial" w:hAnsi="Arial"/>
-          <w:sz w:val="22"/>
-          <w:szCs w:val="22"/>
-          <w:i/>
-        </w:rPr>
-        <w:t xml:space="preserve">timeout</w:t>
-      </w:r>
-      <w:r>
-        <w:rPr>
-          <w:rFonts w:ascii="Arial" w:hAnsi="Arial"/>
-          <w:sz w:val="22"/>
-          <w:szCs w:val="22"/>
-        </w:rPr>
-        <w:t xml:space="preserve"> atau gagal di tengah proses pengunggahan.</w:t>
-      </w:r>
-    </w:p>
-    <w:p>
-      <w:pPr>
-        <w:spacing w:before="60" w:after="60"/>
-        <w:ind w:left="360" w:hanging="180"/>
-      </w:pPr>
-      <w:r>
-        <w:rPr>
-          <w:rFonts w:ascii="Arial" w:hAnsi="Arial"/>
-          <w:b/>
-          <w:sz w:val="22"/>
-        </w:rPr>
-        <w:t>16. </w:t>
-      </w:r>
-      <w:r>
-        <w:rPr>
-          <w:rFonts w:ascii="Arial" w:hAnsi="Arial"/>
-          <w:sz w:val="22"/>
-          <w:szCs w:val="22"/>
-          <w:b/>
-        </w:rPr>
-        <w:t xml:space="preserve">Kurangnya Arsip Digital Siap Unggah</w:t>
-      </w:r>
-      <w:r>
-        <w:rPr>
-          <w:rFonts w:ascii="Arial" w:hAnsi="Arial"/>
-          <w:sz w:val="22"/>
-          <w:szCs w:val="22"/>
-        </w:rPr>
-        <w:t xml:space="preserve">:</w:t>
-      </w:r>
-    </w:p>
+        <w:t xml:space="preserve">#### Tabel 2. Komparasi Data Kuantitatif Sistem Lama vs. Sistem Baru</w:t>
+      </w:r>
+    </w:p>
+    <w:tbl>
+      <w:tblPr>
+        <w:tblStyle w:val="TableGrid"/>
+        <w:tblW w:w="0" w:type="auto"/>
+        <w:tblBorders>
+          <w:top w:val="single" w:sz="4" w:space="0" w:color="CCCCCC"/>
+          <w:left w:val="single" w:sz="4" w:space="0" w:color="CCCCCC"/>
+          <w:bottom w:val="single" w:sz="4" w:space="0" w:color="CCCCCC"/>
+          <w:right w:val="single" w:sz="4" w:space="0" w:color="CCCCCC"/>
+          <w:insideH w:val="single" w:sz="4" w:space="0" w:color="EAEAEA"/>
+          <w:insideV w:val="single" w:sz="4" w:space="0" w:color="EAEAEA"/>
+        </w:tblBorders>
+      </w:tblPr>
+      <w:tr>
+        <w:tc>
+          <w:tcPr>
+            <w:shd w:val="clear" w:color="auto" w:fill="F1F5F9"/>
+          </w:tcPr>
+          <w:p>
+            <w:pPr>
+              <w:spacing w:before="60" w:after="60"/>
+            </w:pPr>
+            <w:r>
+              <w:rPr>
+                <w:rFonts w:ascii="Arial" w:hAnsi="Arial"/>
+                <w:sz w:val="20"/>
+                <w:b/>
+              </w:rPr>
+            </w:r>
+            <w:r>
+              <w:rPr>
+                <w:rFonts w:ascii="Arial" w:hAnsi="Arial"/>
+                <w:sz w:val="22"/>
+                <w:szCs w:val="22"/>
+              </w:rPr>
+              <w:t xml:space="preserve">No</w:t>
+            </w:r>
+          </w:p>
+        </w:tc>
+        <w:tc>
+          <w:tcPr>
+            <w:shd w:val="clear" w:color="auto" w:fill="F1F5F9"/>
+          </w:tcPr>
+          <w:p>
+            <w:pPr>
+              <w:spacing w:before="60" w:after="60"/>
+            </w:pPr>
+            <w:r>
+              <w:rPr>
+                <w:rFonts w:ascii="Arial" w:hAnsi="Arial"/>
+                <w:sz w:val="20"/>
+                <w:b/>
+              </w:rPr>
+            </w:r>
+            <w:r>
+              <w:rPr>
+                <w:rFonts w:ascii="Arial" w:hAnsi="Arial"/>
+                <w:sz w:val="22"/>
+                <w:szCs w:val="22"/>
+              </w:rPr>
+              <w:t xml:space="preserve">Metrik Komparasi Data</w:t>
+            </w:r>
+          </w:p>
+        </w:tc>
+        <w:tc>
+          <w:tcPr>
+            <w:shd w:val="clear" w:color="auto" w:fill="F1F5F9"/>
+          </w:tcPr>
+          <w:p>
+            <w:pPr>
+              <w:spacing w:before="60" w:after="60"/>
+            </w:pPr>
+            <w:r>
+              <w:rPr>
+                <w:rFonts w:ascii="Arial" w:hAnsi="Arial"/>
+                <w:sz w:val="20"/>
+                <w:b/>
+              </w:rPr>
+            </w:r>
+            <w:r>
+              <w:rPr>
+                <w:rFonts w:ascii="Arial" w:hAnsi="Arial"/>
+                <w:sz w:val="22"/>
+                <w:szCs w:val="22"/>
+              </w:rPr>
+              <w:t xml:space="preserve">Basis Data Sistem Lama (`ppid-local.sql`)</w:t>
+            </w:r>
+          </w:p>
+        </w:tc>
+        <w:tc>
+          <w:tcPr>
+            <w:shd w:val="clear" w:color="auto" w:fill="F1F5F9"/>
+          </w:tcPr>
+          <w:p>
+            <w:pPr>
+              <w:spacing w:before="60" w:after="60"/>
+            </w:pPr>
+            <w:r>
+              <w:rPr>
+                <w:rFonts w:ascii="Arial" w:hAnsi="Arial"/>
+                <w:sz w:val="20"/>
+                <w:b/>
+              </w:rPr>
+            </w:r>
+            <w:r>
+              <w:rPr>
+                <w:rFonts w:ascii="Arial" w:hAnsi="Arial"/>
+                <w:sz w:val="22"/>
+                <w:szCs w:val="22"/>
+              </w:rPr>
+              <w:t xml:space="preserve">Basis Data Sistem Baru (`ppidkab_version2.sql`)</w:t>
+            </w:r>
+          </w:p>
+        </w:tc>
+        <w:tc>
+          <w:tcPr>
+            <w:shd w:val="clear" w:color="auto" w:fill="F1F5F9"/>
+          </w:tcPr>
+          <w:p>
+            <w:pPr>
+              <w:spacing w:before="60" w:after="60"/>
+            </w:pPr>
+            <w:r>
+              <w:rPr>
+                <w:rFonts w:ascii="Arial" w:hAnsi="Arial"/>
+                <w:sz w:val="20"/>
+                <w:b/>
+              </w:rPr>
+            </w:r>
+            <w:r>
+              <w:rPr>
+                <w:rFonts w:ascii="Arial" w:hAnsi="Arial"/>
+                <w:sz w:val="22"/>
+                <w:szCs w:val="22"/>
+              </w:rPr>
+              <w:t xml:space="preserve">Analisis &amp; Dampak Optimalisasi</w:t>
+            </w:r>
+          </w:p>
+        </w:tc>
+      </w:tr>
+      <w:tr>
+        <w:tc>
+          <w:tcPr/>
+          <w:p>
+            <w:pPr>
+              <w:spacing w:before="60" w:after="60"/>
+            </w:pPr>
+            <w:r>
+              <w:rPr>
+                <w:rFonts w:ascii="Arial" w:hAnsi="Arial"/>
+                <w:sz w:val="20"/>
+              </w:rPr>
+            </w:r>
+            <w:r>
+              <w:rPr>
+                <w:rFonts w:ascii="Arial" w:hAnsi="Arial"/>
+                <w:sz w:val="22"/>
+                <w:szCs w:val="22"/>
+              </w:rPr>
+              <w:t xml:space="preserve">1</w:t>
+            </w:r>
+          </w:p>
+        </w:tc>
+        <w:tc>
+          <w:tcPr/>
+          <w:p>
+            <w:pPr>
+              <w:spacing w:before="60" w:after="60"/>
+            </w:pPr>
+            <w:r>
+              <w:rPr>
+                <w:rFonts w:ascii="Arial" w:hAnsi="Arial"/>
+                <w:sz w:val="20"/>
+              </w:rPr>
+            </w:r>
+            <w:r>
+              <w:rPr>
+                <w:rFonts w:ascii="Arial" w:hAnsi="Arial"/>
+                <w:sz w:val="22"/>
+                <w:szCs w:val="22"/>
+              </w:rPr>
+              <w:t xml:space="preserve">Jumlah Akun Pengguna / Admin (`user` / `users`)</w:t>
+            </w:r>
+          </w:p>
+        </w:tc>
+        <w:tc>
+          <w:tcPr/>
+          <w:p>
+            <w:pPr>
+              <w:spacing w:before="60" w:after="60"/>
+            </w:pPr>
+            <w:r>
+              <w:rPr>
+                <w:rFonts w:ascii="Arial" w:hAnsi="Arial"/>
+                <w:sz w:val="20"/>
+              </w:rPr>
+            </w:r>
+            <w:r>
+              <w:rPr>
+                <w:rFonts w:ascii="Arial" w:hAnsi="Arial"/>
+                <w:sz w:val="22"/>
+                <w:szCs w:val="22"/>
+              </w:rPr>
+              <w:t xml:space="preserve">20 akun</w:t>
+            </w:r>
+          </w:p>
+        </w:tc>
+        <w:tc>
+          <w:tcPr/>
+          <w:p>
+            <w:pPr>
+              <w:spacing w:before="60" w:after="60"/>
+            </w:pPr>
+            <w:r>
+              <w:rPr>
+                <w:rFonts w:ascii="Arial" w:hAnsi="Arial"/>
+                <w:sz w:val="20"/>
+              </w:rPr>
+            </w:r>
+            <w:r>
+              <w:rPr>
+                <w:rFonts w:ascii="Arial" w:hAnsi="Arial"/>
+                <w:sz w:val="22"/>
+                <w:szCs w:val="22"/>
+              </w:rPr>
+              <w:t xml:space="preserve">60 akun</w:t>
+            </w:r>
+          </w:p>
+        </w:tc>
+        <w:tc>
+          <w:tcPr/>
+          <w:p>
+            <w:pPr>
+              <w:spacing w:before="60" w:after="60"/>
+            </w:pPr>
+            <w:r>
+              <w:rPr>
+                <w:rFonts w:ascii="Arial" w:hAnsi="Arial"/>
+                <w:sz w:val="20"/>
+              </w:rPr>
+            </w:r>
+            <w:r>
+              <w:rPr>
+                <w:rFonts w:ascii="Arial" w:hAnsi="Arial"/>
+                <w:sz w:val="22"/>
+                <w:szCs w:val="22"/>
+                <w:b/>
+              </w:rPr>
+              <w:t xml:space="preserve">Peningkatan 300%</w:t>
+            </w:r>
+            <w:r>
+              <w:rPr>
+                <w:rFonts w:ascii="Arial" w:hAnsi="Arial"/>
+                <w:sz w:val="22"/>
+                <w:szCs w:val="22"/>
+              </w:rPr>
+              <w:t xml:space="preserve">. Menunjukkan adopsi sistem yang jauh lebih luas oleh admin pembantu di tingkat dinas, kecamatan, kelurahan, dan desa di Kabupaten Sinjai.</w:t>
+            </w:r>
+          </w:p>
+        </w:tc>
+      </w:tr>
+      <w:tr>
+        <w:tc>
+          <w:tcPr/>
+          <w:p>
+            <w:pPr>
+              <w:spacing w:before="60" w:after="60"/>
+            </w:pPr>
+            <w:r>
+              <w:rPr>
+                <w:rFonts w:ascii="Arial" w:hAnsi="Arial"/>
+                <w:sz w:val="20"/>
+              </w:rPr>
+            </w:r>
+            <w:r>
+              <w:rPr>
+                <w:rFonts w:ascii="Arial" w:hAnsi="Arial"/>
+                <w:sz w:val="22"/>
+                <w:szCs w:val="22"/>
+              </w:rPr>
+              <w:t xml:space="preserve">2</w:t>
+            </w:r>
+          </w:p>
+        </w:tc>
+        <w:tc>
+          <w:tcPr/>
+          <w:p>
+            <w:pPr>
+              <w:spacing w:before="60" w:after="60"/>
+            </w:pPr>
+            <w:r>
+              <w:rPr>
+                <w:rFonts w:ascii="Arial" w:hAnsi="Arial"/>
+                <w:sz w:val="20"/>
+              </w:rPr>
+            </w:r>
+            <w:r>
+              <w:rPr>
+                <w:rFonts w:ascii="Arial" w:hAnsi="Arial"/>
+                <w:sz w:val="22"/>
+                <w:szCs w:val="22"/>
+              </w:rPr>
+              <w:t xml:space="preserve">Jumlah Dokumen Publik Utama (`dok_data` / `informasis`)</w:t>
+            </w:r>
+          </w:p>
+        </w:tc>
+        <w:tc>
+          <w:tcPr/>
+          <w:p>
+            <w:pPr>
+              <w:spacing w:before="60" w:after="60"/>
+            </w:pPr>
+            <w:r>
+              <w:rPr>
+                <w:rFonts w:ascii="Arial" w:hAnsi="Arial"/>
+                <w:sz w:val="20"/>
+              </w:rPr>
+            </w:r>
+            <w:r>
+              <w:rPr>
+                <w:rFonts w:ascii="Arial" w:hAnsi="Arial"/>
+                <w:sz w:val="22"/>
+                <w:szCs w:val="22"/>
+              </w:rPr>
+              <w:t xml:space="preserve">1.100 data</w:t>
+            </w:r>
+          </w:p>
+        </w:tc>
+        <w:tc>
+          <w:tcPr/>
+          <w:p>
+            <w:pPr>
+              <w:spacing w:before="60" w:after="60"/>
+            </w:pPr>
+            <w:r>
+              <w:rPr>
+                <w:rFonts w:ascii="Arial" w:hAnsi="Arial"/>
+                <w:sz w:val="20"/>
+              </w:rPr>
+            </w:r>
+            <w:r>
+              <w:rPr>
+                <w:rFonts w:ascii="Arial" w:hAnsi="Arial"/>
+                <w:sz w:val="22"/>
+                <w:szCs w:val="22"/>
+              </w:rPr>
+              <w:t xml:space="preserve">275 data</w:t>
+            </w:r>
+          </w:p>
+        </w:tc>
+        <w:tc>
+          <w:tcPr/>
+          <w:p>
+            <w:pPr>
+              <w:spacing w:before="60" w:after="60"/>
+            </w:pPr>
+            <w:r>
+              <w:rPr>
+                <w:rFonts w:ascii="Arial" w:hAnsi="Arial"/>
+                <w:sz w:val="20"/>
+              </w:rPr>
+            </w:r>
+            <w:r>
+              <w:rPr>
+                <w:rFonts w:ascii="Arial" w:hAnsi="Arial"/>
+                <w:sz w:val="22"/>
+                <w:szCs w:val="22"/>
+                <w:b/>
+              </w:rPr>
+              <w:t xml:space="preserve">Reduksi &amp; Restrukturisasi</w:t>
+            </w:r>
+            <w:r>
+              <w:rPr>
+                <w:rFonts w:ascii="Arial" w:hAnsi="Arial"/>
+                <w:sz w:val="22"/>
+                <w:szCs w:val="22"/>
+              </w:rPr>
+              <w:t xml:space="preserve">. Pada sistem lama, semua data ditumpuk secara redundan tanpa klasifikasi ketat. Sistem baru membagi dokumen secara spesifik dan terverifikasi untuk efisiensi kueri.</w:t>
+            </w:r>
+          </w:p>
+        </w:tc>
+      </w:tr>
+      <w:tr>
+        <w:tc>
+          <w:tcPr/>
+          <w:p>
+            <w:pPr>
+              <w:spacing w:before="60" w:after="60"/>
+            </w:pPr>
+            <w:r>
+              <w:rPr>
+                <w:rFonts w:ascii="Arial" w:hAnsi="Arial"/>
+                <w:sz w:val="20"/>
+              </w:rPr>
+            </w:r>
+            <w:r>
+              <w:rPr>
+                <w:rFonts w:ascii="Arial" w:hAnsi="Arial"/>
+                <w:sz w:val="22"/>
+                <w:szCs w:val="22"/>
+              </w:rPr>
+              <w:t xml:space="preserve">3</w:t>
+            </w:r>
+          </w:p>
+        </w:tc>
+        <w:tc>
+          <w:tcPr/>
+          <w:p>
+            <w:pPr>
+              <w:spacing w:before="60" w:after="60"/>
+            </w:pPr>
+            <w:r>
+              <w:rPr>
+                <w:rFonts w:ascii="Arial" w:hAnsi="Arial"/>
+                <w:sz w:val="20"/>
+              </w:rPr>
+            </w:r>
+            <w:r>
+              <w:rPr>
+                <w:rFonts w:ascii="Arial" w:hAnsi="Arial"/>
+                <w:sz w:val="22"/>
+                <w:szCs w:val="22"/>
+              </w:rPr>
+              <w:t xml:space="preserve">Pemetaan Entitas Organisasi Pembantu (`organizations`)</w:t>
+            </w:r>
+          </w:p>
+        </w:tc>
+        <w:tc>
+          <w:tcPr/>
+          <w:p>
+            <w:pPr>
+              <w:spacing w:before="60" w:after="60"/>
+            </w:pPr>
+            <w:r>
+              <w:rPr>
+                <w:rFonts w:ascii="Arial" w:hAnsi="Arial"/>
+                <w:sz w:val="20"/>
+              </w:rPr>
+            </w:r>
+            <w:r>
+              <w:rPr>
+                <w:rFonts w:ascii="Arial" w:hAnsi="Arial"/>
+                <w:sz w:val="22"/>
+                <w:szCs w:val="22"/>
+              </w:rPr>
+              <w:t xml:space="preserve">- (Belum terstruktur)</w:t>
+            </w:r>
+          </w:p>
+        </w:tc>
+        <w:tc>
+          <w:tcPr/>
+          <w:p>
+            <w:pPr>
+              <w:spacing w:before="60" w:after="60"/>
+            </w:pPr>
+            <w:r>
+              <w:rPr>
+                <w:rFonts w:ascii="Arial" w:hAnsi="Arial"/>
+                <w:sz w:val="20"/>
+              </w:rPr>
+            </w:r>
+            <w:r>
+              <w:rPr>
+                <w:rFonts w:ascii="Arial" w:hAnsi="Arial"/>
+                <w:sz w:val="22"/>
+                <w:szCs w:val="22"/>
+              </w:rPr>
+              <w:t xml:space="preserve">123 entitas</w:t>
+            </w:r>
+          </w:p>
+        </w:tc>
+        <w:tc>
+          <w:tcPr/>
+          <w:p>
+            <w:pPr>
+              <w:spacing w:before="60" w:after="60"/>
+            </w:pPr>
+            <w:r>
+              <w:rPr>
+                <w:rFonts w:ascii="Arial" w:hAnsi="Arial"/>
+                <w:sz w:val="20"/>
+              </w:rPr>
+            </w:r>
+            <w:r>
+              <w:rPr>
+                <w:rFonts w:ascii="Arial" w:hAnsi="Arial"/>
+                <w:sz w:val="22"/>
+                <w:szCs w:val="22"/>
+                <w:b/>
+              </w:rPr>
+              <w:t xml:space="preserve">Strukturisasi Sektoral</w:t>
+            </w:r>
+            <w:r>
+              <w:rPr>
+                <w:rFonts w:ascii="Arial" w:hAnsi="Arial"/>
+                <w:sz w:val="22"/>
+                <w:szCs w:val="22"/>
+              </w:rPr>
+              <w:t xml:space="preserve">. Sistem baru memetakan secara presisi 123 instansi pembantu di Sinjai secara relasional untuk pembagian wewenang yang aman.</w:t>
+            </w:r>
+          </w:p>
+        </w:tc>
+      </w:tr>
+      <w:tr>
+        <w:tc>
+          <w:tcPr/>
+          <w:p>
+            <w:pPr>
+              <w:spacing w:before="60" w:after="60"/>
+            </w:pPr>
+            <w:r>
+              <w:rPr>
+                <w:rFonts w:ascii="Arial" w:hAnsi="Arial"/>
+                <w:sz w:val="20"/>
+              </w:rPr>
+            </w:r>
+            <w:r>
+              <w:rPr>
+                <w:rFonts w:ascii="Arial" w:hAnsi="Arial"/>
+                <w:sz w:val="22"/>
+                <w:szCs w:val="22"/>
+              </w:rPr>
+              <w:t xml:space="preserve">4</w:t>
+            </w:r>
+          </w:p>
+        </w:tc>
+        <w:tc>
+          <w:tcPr/>
+          <w:p>
+            <w:pPr>
+              <w:spacing w:before="60" w:after="60"/>
+            </w:pPr>
+            <w:r>
+              <w:rPr>
+                <w:rFonts w:ascii="Arial" w:hAnsi="Arial"/>
+                <w:sz w:val="20"/>
+              </w:rPr>
+            </w:r>
+            <w:r>
+              <w:rPr>
+                <w:rFonts w:ascii="Arial" w:hAnsi="Arial"/>
+                <w:sz w:val="22"/>
+                <w:szCs w:val="22"/>
+              </w:rPr>
+              <w:t xml:space="preserve">Pemetaan Profil Pejabat Publik (`officials`)</w:t>
+            </w:r>
+          </w:p>
+        </w:tc>
+        <w:tc>
+          <w:tcPr/>
+          <w:p>
+            <w:pPr>
+              <w:spacing w:before="60" w:after="60"/>
+            </w:pPr>
+            <w:r>
+              <w:rPr>
+                <w:rFonts w:ascii="Arial" w:hAnsi="Arial"/>
+                <w:sz w:val="20"/>
+              </w:rPr>
+            </w:r>
+            <w:r>
+              <w:rPr>
+                <w:rFonts w:ascii="Arial" w:hAnsi="Arial"/>
+                <w:sz w:val="22"/>
+                <w:szCs w:val="22"/>
+              </w:rPr>
+              <w:t xml:space="preserve">- (Tidak ada)</w:t>
+            </w:r>
+          </w:p>
+        </w:tc>
+        <w:tc>
+          <w:tcPr/>
+          <w:p>
+            <w:pPr>
+              <w:spacing w:before="60" w:after="60"/>
+            </w:pPr>
+            <w:r>
+              <w:rPr>
+                <w:rFonts w:ascii="Arial" w:hAnsi="Arial"/>
+                <w:sz w:val="20"/>
+              </w:rPr>
+            </w:r>
+            <w:r>
+              <w:rPr>
+                <w:rFonts w:ascii="Arial" w:hAnsi="Arial"/>
+                <w:sz w:val="22"/>
+                <w:szCs w:val="22"/>
+              </w:rPr>
+              <w:t xml:space="preserve">124 profil</w:t>
+            </w:r>
+          </w:p>
+        </w:tc>
+        <w:tc>
+          <w:tcPr/>
+          <w:p>
+            <w:pPr>
+              <w:spacing w:before="60" w:after="60"/>
+            </w:pPr>
+            <w:r>
+              <w:rPr>
+                <w:rFonts w:ascii="Arial" w:hAnsi="Arial"/>
+                <w:sz w:val="20"/>
+              </w:rPr>
+            </w:r>
+            <w:r>
+              <w:rPr>
+                <w:rFonts w:ascii="Arial" w:hAnsi="Arial"/>
+                <w:sz w:val="22"/>
+                <w:szCs w:val="22"/>
+                <w:b/>
+              </w:rPr>
+              <w:t xml:space="preserve">Transparansi Profil</w:t>
+            </w:r>
+            <w:r>
+              <w:rPr>
+                <w:rFonts w:ascii="Arial" w:hAnsi="Arial"/>
+                <w:sz w:val="22"/>
+                <w:szCs w:val="22"/>
+              </w:rPr>
+              <w:t xml:space="preserve">. Sistem baru menyediakan profil terstruktur pejabat untuk kemudahan audit informasi publik.</w:t>
+            </w:r>
+          </w:p>
+        </w:tc>
+      </w:tr>
+      <w:tr>
+        <w:tc>
+          <w:tcPr/>
+          <w:p>
+            <w:pPr>
+              <w:spacing w:before="60" w:after="60"/>
+            </w:pPr>
+            <w:r>
+              <w:rPr>
+                <w:rFonts w:ascii="Arial" w:hAnsi="Arial"/>
+                <w:sz w:val="20"/>
+              </w:rPr>
+            </w:r>
+            <w:r>
+              <w:rPr>
+                <w:rFonts w:ascii="Arial" w:hAnsi="Arial"/>
+                <w:sz w:val="22"/>
+                <w:szCs w:val="22"/>
+              </w:rPr>
+              <w:t xml:space="preserve">5</w:t>
+            </w:r>
+          </w:p>
+        </w:tc>
+        <w:tc>
+          <w:tcPr/>
+          <w:p>
+            <w:pPr>
+              <w:spacing w:before="60" w:after="60"/>
+            </w:pPr>
+            <w:r>
+              <w:rPr>
+                <w:rFonts w:ascii="Arial" w:hAnsi="Arial"/>
+                <w:sz w:val="20"/>
+              </w:rPr>
+            </w:r>
+            <w:r>
+              <w:rPr>
+                <w:rFonts w:ascii="Arial" w:hAnsi="Arial"/>
+                <w:sz w:val="22"/>
+                <w:szCs w:val="22"/>
+              </w:rPr>
+              <w:t xml:space="preserve">Permohonan Informasi dari Publik (`permohonan_data` / `permohonan_informasi`)</w:t>
+            </w:r>
+          </w:p>
+        </w:tc>
+        <w:tc>
+          <w:tcPr/>
+          <w:p>
+            <w:pPr>
+              <w:spacing w:before="60" w:after="60"/>
+            </w:pPr>
+            <w:r>
+              <w:rPr>
+                <w:rFonts w:ascii="Arial" w:hAnsi="Arial"/>
+                <w:sz w:val="20"/>
+              </w:rPr>
+            </w:r>
+            <w:r>
+              <w:rPr>
+                <w:rFonts w:ascii="Arial" w:hAnsi="Arial"/>
+                <w:sz w:val="22"/>
+                <w:szCs w:val="22"/>
+              </w:rPr>
+              <w:t xml:space="preserve">34 permohonan</w:t>
+            </w:r>
+          </w:p>
+        </w:tc>
+        <w:tc>
+          <w:tcPr/>
+          <w:p>
+            <w:pPr>
+              <w:spacing w:before="60" w:after="60"/>
+            </w:pPr>
+            <w:r>
+              <w:rPr>
+                <w:rFonts w:ascii="Arial" w:hAnsi="Arial"/>
+                <w:sz w:val="20"/>
+              </w:rPr>
+            </w:r>
+            <w:r>
+              <w:rPr>
+                <w:rFonts w:ascii="Arial" w:hAnsi="Arial"/>
+                <w:sz w:val="22"/>
+                <w:szCs w:val="22"/>
+              </w:rPr>
+              <w:t xml:space="preserve">8 permohonan</w:t>
+            </w:r>
+          </w:p>
+        </w:tc>
+        <w:tc>
+          <w:tcPr/>
+          <w:p>
+            <w:pPr>
+              <w:spacing w:before="60" w:after="60"/>
+            </w:pPr>
+            <w:r>
+              <w:rPr>
+                <w:rFonts w:ascii="Arial" w:hAnsi="Arial"/>
+                <w:sz w:val="20"/>
+              </w:rPr>
+            </w:r>
+            <w:r>
+              <w:rPr>
+                <w:rFonts w:ascii="Arial" w:hAnsi="Arial"/>
+                <w:sz w:val="22"/>
+                <w:szCs w:val="22"/>
+                <w:b/>
+              </w:rPr>
+              <w:t xml:space="preserve">Validasi Alur Digital</w:t>
+            </w:r>
+            <w:r>
+              <w:rPr>
+                <w:rFonts w:ascii="Arial" w:hAnsi="Arial"/>
+                <w:sz w:val="22"/>
+                <w:szCs w:val="22"/>
+              </w:rPr>
+              <w:t xml:space="preserve">. Permohonan pada sistem baru disaring dengan verifikasi identitas pemohon yang lebih ketat guna mencegah spam data.</w:t>
+            </w:r>
+          </w:p>
+        </w:tc>
+      </w:tr>
+      <w:tr>
+        <w:tc>
+          <w:tcPr/>
+          <w:p>
+            <w:pPr>
+              <w:spacing w:before="60" w:after="60"/>
+            </w:pPr>
+            <w:r>
+              <w:rPr>
+                <w:rFonts w:ascii="Arial" w:hAnsi="Arial"/>
+                <w:sz w:val="20"/>
+              </w:rPr>
+            </w:r>
+            <w:r>
+              <w:rPr>
+                <w:rFonts w:ascii="Arial" w:hAnsi="Arial"/>
+                <w:sz w:val="22"/>
+                <w:szCs w:val="22"/>
+              </w:rPr>
+              <w:t xml:space="preserve">6</w:t>
+            </w:r>
+          </w:p>
+        </w:tc>
+        <w:tc>
+          <w:tcPr/>
+          <w:p>
+            <w:pPr>
+              <w:spacing w:before="60" w:after="60"/>
+            </w:pPr>
+            <w:r>
+              <w:rPr>
+                <w:rFonts w:ascii="Arial" w:hAnsi="Arial"/>
+                <w:sz w:val="20"/>
+              </w:rPr>
+            </w:r>
+            <w:r>
+              <w:rPr>
+                <w:rFonts w:ascii="Arial" w:hAnsi="Arial"/>
+                <w:sz w:val="22"/>
+                <w:szCs w:val="22"/>
+              </w:rPr>
+              <w:t xml:space="preserve">Sub-Standar Layanan Regulasi (`sub_standar_layanans`)</w:t>
+            </w:r>
+          </w:p>
+        </w:tc>
+        <w:tc>
+          <w:tcPr/>
+          <w:p>
+            <w:pPr>
+              <w:spacing w:before="60" w:after="60"/>
+            </w:pPr>
+            <w:r>
+              <w:rPr>
+                <w:rFonts w:ascii="Arial" w:hAnsi="Arial"/>
+                <w:sz w:val="20"/>
+              </w:rPr>
+            </w:r>
+            <w:r>
+              <w:rPr>
+                <w:rFonts w:ascii="Arial" w:hAnsi="Arial"/>
+                <w:sz w:val="22"/>
+                <w:szCs w:val="22"/>
+              </w:rPr>
+              <w:t xml:space="preserve">- (Manual/Mentah)</w:t>
+            </w:r>
+          </w:p>
+        </w:tc>
+        <w:tc>
+          <w:tcPr/>
+          <w:p>
+            <w:pPr>
+              <w:spacing w:before="60" w:after="60"/>
+            </w:pPr>
+            <w:r>
+              <w:rPr>
+                <w:rFonts w:ascii="Arial" w:hAnsi="Arial"/>
+                <w:sz w:val="20"/>
+              </w:rPr>
+            </w:r>
+            <w:r>
+              <w:rPr>
+                <w:rFonts w:ascii="Arial" w:hAnsi="Arial"/>
+                <w:sz w:val="22"/>
+                <w:szCs w:val="22"/>
+              </w:rPr>
+              <w:t xml:space="preserve">15 data regulasi</w:t>
+            </w:r>
+          </w:p>
+        </w:tc>
+        <w:tc>
+          <w:tcPr/>
+          <w:p>
+            <w:pPr>
+              <w:spacing w:before="60" w:after="60"/>
+            </w:pPr>
+            <w:r>
+              <w:rPr>
+                <w:rFonts w:ascii="Arial" w:hAnsi="Arial"/>
+                <w:sz w:val="20"/>
+              </w:rPr>
+            </w:r>
+            <w:r>
+              <w:rPr>
+                <w:rFonts w:ascii="Arial" w:hAnsi="Arial"/>
+                <w:sz w:val="22"/>
+                <w:szCs w:val="22"/>
+                <w:b/>
+              </w:rPr>
+              <w:t xml:space="preserve">Kepatuhan Hukum</w:t>
+            </w:r>
+            <w:r>
+              <w:rPr>
+                <w:rFonts w:ascii="Arial" w:hAnsi="Arial"/>
+                <w:sz w:val="22"/>
+                <w:szCs w:val="22"/>
+              </w:rPr>
+              <w:t xml:space="preserve">. Sistem baru mengintegrasikan 15 instrumen regulasi (seperti SOP dan Maklumat) secara </w:t>
+            </w:r>
+            <w:r>
+              <w:rPr>
+                <w:rFonts w:ascii="Arial" w:hAnsi="Arial"/>
+                <w:sz w:val="22"/>
+                <w:szCs w:val="22"/>
+                <w:i/>
+              </w:rPr>
+              <w:t xml:space="preserve">built-in</w:t>
+            </w:r>
+            <w:r>
+              <w:rPr>
+                <w:rFonts w:ascii="Arial" w:hAnsi="Arial"/>
+                <w:sz w:val="22"/>
+                <w:szCs w:val="22"/>
+              </w:rPr>
+              <w:t xml:space="preserve"> pada database.</w:t>
+            </w:r>
+          </w:p>
+        </w:tc>
+      </w:tr>
+    </w:tbl>
     <w:p>
       <w:pPr>
         <w:spacing w:before="120" w:after="120"/>
@@ -3803,86 +4608,7 @@
           <w:sz w:val="22"/>
           <w:szCs w:val="22"/>
         </w:rPr>
-        <w:t xml:space="preserve">Operator seringkali menerima berkas dalam bentuk dokumen fisik (</w:t>
-      </w:r>
-      <w:r>
-        <w:rPr>
-          <w:rFonts w:ascii="Arial" w:hAnsi="Arial"/>
-          <w:sz w:val="22"/>
-          <w:szCs w:val="22"/>
-          <w:i/>
-        </w:rPr>
-        <w:t xml:space="preserve">hardcopy</w:t>
-      </w:r>
-      <w:r>
-        <w:rPr>
-          <w:rFonts w:ascii="Arial" w:hAnsi="Arial"/>
-          <w:sz w:val="22"/>
-          <w:szCs w:val="22"/>
-        </w:rPr>
-        <w:t xml:space="preserve">) dari sub-bagian kerja di OPD mereka, sehingga harus melakukan pemindaian (</w:t>
-      </w:r>
-      <w:r>
-        <w:rPr>
-          <w:rFonts w:ascii="Arial" w:hAnsi="Arial"/>
-          <w:sz w:val="22"/>
-          <w:szCs w:val="22"/>
-          <w:i/>
-        </w:rPr>
-        <w:t xml:space="preserve">scanning</w:t>
-      </w:r>
-      <w:r>
-        <w:rPr>
-          <w:rFonts w:ascii="Arial" w:hAnsi="Arial"/>
-          <w:sz w:val="22"/>
-          <w:szCs w:val="22"/>
-        </w:rPr>
-        <w:t xml:space="preserve">) manual terlebih dahulu sebelum diunggah ke website PPID.</w:t>
-      </w:r>
-    </w:p>
-    <w:p>
-      <w:pPr>
-        <w:spacing w:before="60" w:after="60"/>
-        <w:ind w:left="360" w:hanging="180"/>
-      </w:pPr>
-      <w:r>
-        <w:rPr>
-          <w:rFonts w:ascii="Arial" w:hAnsi="Arial"/>
-          <w:b/>
-          <w:sz w:val="22"/>
-        </w:rPr>
-        <w:t>17. </w:t>
-      </w:r>
-      <w:r>
-        <w:rPr>
-          <w:rFonts w:ascii="Arial" w:hAnsi="Arial"/>
-          <w:sz w:val="22"/>
-          <w:szCs w:val="22"/>
-          <w:b/>
-        </w:rPr>
-        <w:t xml:space="preserve">Prosedur Koordinasi Evaluasi Kelengkapan</w:t>
-      </w:r>
-      <w:r>
-        <w:rPr>
-          <w:rFonts w:ascii="Arial" w:hAnsi="Arial"/>
-          <w:sz w:val="22"/>
-          <w:szCs w:val="22"/>
-        </w:rPr>
-        <w:t xml:space="preserve">:</w:t>
-      </w:r>
-    </w:p>
-    <w:p>
-      <w:pPr>
-        <w:spacing w:before="120" w:after="120"/>
-        <w:jc w:val="both"/>
-      </w:pPr>
-      <w:r>
-        <w:rPr>
-          <w:rFonts w:ascii="Arial" w:hAnsi="Arial"/>
-          <w:sz w:val="22"/>
-          <w:szCs w:val="22"/>
-        </w:rPr>
-        <w:t xml:space="preserve">Operator tidak memiliki cara untuk melihat apakah dokumen yang mereka unggah sudah memenuhi standar PPID Utama secara mandiri. Mereka harus menunggu konfirmasi manual via aplikasi WhatsApp atau surat dari Diskominfo.</w:t>
+        <w:t xml:space="preserve">Restrukturisasi basis data ini mencerminkan perubahan dari pola penyimpanan file yang kaku dan redundan menjadi arsitektur database relasional yang lebih fleksibel, bersih, dan berorientasi pada kemudahan pencarian dokumen.</w:t>
       </w:r>
     </w:p>
     <w:p>
@@ -3898,7 +4624,223 @@
           <w:sz w:val="24"/>
           <w:szCs w:val="24"/>
         </w:rPr>
-        <w:t>4.5. Rekomendasi Aksi Pembenahan Website PPID</w:t>
+        <w:t>4.5. Analisis Keluhan Kualitatif Operator</w:t>
+      </w:r>
+    </w:p>
+    <w:p>
+      <w:pPr>
+        <w:spacing w:before="120" w:after="120"/>
+        <w:jc w:val="both"/>
+      </w:pPr>
+      <w:r>
+        <w:rPr>
+          <w:rFonts w:ascii="Arial" w:hAnsi="Arial"/>
+          <w:sz w:val="22"/>
+          <w:szCs w:val="22"/>
+        </w:rPr>
+        <w:t xml:space="preserve">Melalui pertanyaan terbuka, diidentifikasi beberapa kendala utama yang dirasakan operator OPD saat mengoperasikan website PPID Kabupaten Sinjai:</w:t>
+      </w:r>
+    </w:p>
+    <w:p>
+      <w:pPr>
+        <w:spacing w:before="60" w:after="60"/>
+        <w:ind w:left="360" w:hanging="180"/>
+      </w:pPr>
+      <w:r>
+        <w:rPr>
+          <w:rFonts w:ascii="Arial" w:hAnsi="Arial"/>
+          <w:b/>
+          <w:sz w:val="22"/>
+        </w:rPr>
+        <w:t>15. </w:t>
+      </w:r>
+      <w:r>
+        <w:rPr>
+          <w:rFonts w:ascii="Arial" w:hAnsi="Arial"/>
+          <w:sz w:val="22"/>
+          <w:szCs w:val="22"/>
+          <w:b/>
+        </w:rPr>
+        <w:t xml:space="preserve">Masalah Kestabilan Akses Jaringan Internet</w:t>
+      </w:r>
+      <w:r>
+        <w:rPr>
+          <w:rFonts w:ascii="Arial" w:hAnsi="Arial"/>
+          <w:sz w:val="22"/>
+          <w:szCs w:val="22"/>
+        </w:rPr>
+        <w:t xml:space="preserve">:</w:t>
+      </w:r>
+    </w:p>
+    <w:p>
+      <w:pPr>
+        <w:spacing w:before="120" w:after="120"/>
+        <w:jc w:val="both"/>
+      </w:pPr>
+      <w:r>
+        <w:rPr>
+          <w:rFonts w:ascii="Arial" w:hAnsi="Arial"/>
+          <w:sz w:val="22"/>
+          <w:szCs w:val="22"/>
+        </w:rPr>
+        <w:t xml:space="preserve">Sebagian besar kantor OPD di Kabupaten Sinjai mengalami keterbatasan kecepatan dan kestabilan koneksi internet. Ketika operator harus mengunggah file dokumen PDF berukuran besar, sistem sering mengalami </w:t>
+      </w:r>
+      <w:r>
+        <w:rPr>
+          <w:rFonts w:ascii="Arial" w:hAnsi="Arial"/>
+          <w:sz w:val="22"/>
+          <w:szCs w:val="22"/>
+          <w:i/>
+        </w:rPr>
+        <w:t xml:space="preserve">timeout</w:t>
+      </w:r>
+      <w:r>
+        <w:rPr>
+          <w:rFonts w:ascii="Arial" w:hAnsi="Arial"/>
+          <w:sz w:val="22"/>
+          <w:szCs w:val="22"/>
+        </w:rPr>
+        <w:t xml:space="preserve"> atau gagal di tengah proses pengunggahan.</w:t>
+      </w:r>
+    </w:p>
+    <w:p>
+      <w:pPr>
+        <w:spacing w:before="60" w:after="60"/>
+        <w:ind w:left="360" w:hanging="180"/>
+      </w:pPr>
+      <w:r>
+        <w:rPr>
+          <w:rFonts w:ascii="Arial" w:hAnsi="Arial"/>
+          <w:b/>
+          <w:sz w:val="22"/>
+        </w:rPr>
+        <w:t>16. </w:t>
+      </w:r>
+      <w:r>
+        <w:rPr>
+          <w:rFonts w:ascii="Arial" w:hAnsi="Arial"/>
+          <w:sz w:val="22"/>
+          <w:szCs w:val="22"/>
+          <w:b/>
+        </w:rPr>
+        <w:t xml:space="preserve">Kurangnya Arsip Digital Siap Unggah</w:t>
+      </w:r>
+      <w:r>
+        <w:rPr>
+          <w:rFonts w:ascii="Arial" w:hAnsi="Arial"/>
+          <w:sz w:val="22"/>
+          <w:szCs w:val="22"/>
+        </w:rPr>
+        <w:t xml:space="preserve">:</w:t>
+      </w:r>
+    </w:p>
+    <w:p>
+      <w:pPr>
+        <w:spacing w:before="120" w:after="120"/>
+        <w:jc w:val="both"/>
+      </w:pPr>
+      <w:r>
+        <w:rPr>
+          <w:rFonts w:ascii="Arial" w:hAnsi="Arial"/>
+          <w:sz w:val="22"/>
+          <w:szCs w:val="22"/>
+        </w:rPr>
+        <w:t xml:space="preserve">Operator seringkali menerima berkas dalam bentuk dokumen fisik (</w:t>
+      </w:r>
+      <w:r>
+        <w:rPr>
+          <w:rFonts w:ascii="Arial" w:hAnsi="Arial"/>
+          <w:sz w:val="22"/>
+          <w:szCs w:val="22"/>
+          <w:i/>
+        </w:rPr>
+        <w:t xml:space="preserve">hardcopy</w:t>
+      </w:r>
+      <w:r>
+        <w:rPr>
+          <w:rFonts w:ascii="Arial" w:hAnsi="Arial"/>
+          <w:sz w:val="22"/>
+          <w:szCs w:val="22"/>
+        </w:rPr>
+        <w:t xml:space="preserve">) dari sub-bagian kerja di OPD mereka, sehingga harus melakukan pemindaian (</w:t>
+      </w:r>
+      <w:r>
+        <w:rPr>
+          <w:rFonts w:ascii="Arial" w:hAnsi="Arial"/>
+          <w:sz w:val="22"/>
+          <w:szCs w:val="22"/>
+          <w:i/>
+        </w:rPr>
+        <w:t xml:space="preserve">scanning</w:t>
+      </w:r>
+      <w:r>
+        <w:rPr>
+          <w:rFonts w:ascii="Arial" w:hAnsi="Arial"/>
+          <w:sz w:val="22"/>
+          <w:szCs w:val="22"/>
+        </w:rPr>
+        <w:t xml:space="preserve">) manual terlebih dahulu sebelum diunggah ke website PPID.</w:t>
+      </w:r>
+    </w:p>
+    <w:p>
+      <w:pPr>
+        <w:spacing w:before="60" w:after="60"/>
+        <w:ind w:left="360" w:hanging="180"/>
+      </w:pPr>
+      <w:r>
+        <w:rPr>
+          <w:rFonts w:ascii="Arial" w:hAnsi="Arial"/>
+          <w:b/>
+          <w:sz w:val="22"/>
+        </w:rPr>
+        <w:t>17. </w:t>
+      </w:r>
+      <w:r>
+        <w:rPr>
+          <w:rFonts w:ascii="Arial" w:hAnsi="Arial"/>
+          <w:sz w:val="22"/>
+          <w:szCs w:val="22"/>
+          <w:b/>
+        </w:rPr>
+        <w:t xml:space="preserve">Prosedur Koordinasi Evaluasi Kelengkapan</w:t>
+      </w:r>
+      <w:r>
+        <w:rPr>
+          <w:rFonts w:ascii="Arial" w:hAnsi="Arial"/>
+          <w:sz w:val="22"/>
+          <w:szCs w:val="22"/>
+        </w:rPr>
+        <w:t xml:space="preserve">:</w:t>
+      </w:r>
+    </w:p>
+    <w:p>
+      <w:pPr>
+        <w:spacing w:before="120" w:after="120"/>
+        <w:jc w:val="both"/>
+      </w:pPr>
+      <w:r>
+        <w:rPr>
+          <w:rFonts w:ascii="Arial" w:hAnsi="Arial"/>
+          <w:sz w:val="22"/>
+          <w:szCs w:val="22"/>
+        </w:rPr>
+        <w:t xml:space="preserve">Operator tidak memiliki cara untuk melihat apakah dokumen yang mereka unggah sudah memenuhi standar PPID Utama secara mandiri. Mereka harus menunggu konfirmasi manual via aplikasi WhatsApp atau surat dari Diskominfo.</w:t>
+      </w:r>
+    </w:p>
+    <w:p>
+      <w:pPr>
+        <w:pStyle w:val="Heading3"/>
+        <w:spacing w:before="240" w:after="120"/>
+        <w:keepNext/>
+      </w:pPr>
+      <w:r>
+        <w:rPr>
+          <w:rFonts w:ascii="Arial" w:hAnsi="Arial"/>
+          <w:b/>
+          <w:sz w:val="24"/>
+          <w:szCs w:val="24"/>
+        </w:rPr>
+        <w:t>4.6. Rekomendasi Aksi Pembenahan Website PPID</w:t>
       </w:r>
     </w:p>
     <w:p>

</xml_diff>

<commit_message>
Clarify offline upload as future development recommendation
</commit_message>
<xml_diff>
--- a/jurnal_fix.docx
+++ b/jurnal_fix.docx
@@ -206,7 +206,7 @@
           <w:sz w:val="22"/>
           <w:szCs w:val="22"/>
         </w:rPr>
-        <w:t xml:space="preserve">Keterbukaan informasi publik merupakan pilar utama dalam mewujudkan tata kelola pemerintahan yang bersih, transparan, dan akuntabel. Dinas Komunikasi Informatika dan Persandian (Diskominfo) Kabupaten Sinjai mengimplementasikan langkah optimalisasi dan pembaruan terhadap website Pejabat Pengelola Informasi dan Dokumentasi (PPID) sebagai peningkatan dari sistem web sebelumnya yang dirasa kurang efisien. Penelitian ini bertujuan untuk melakukan evaluasi secara mendalam terhadap aspek </w:t>
+        <w:t xml:space="preserve">Keterbukaan informasi publik merupakan pilar utama dalam mewujudkan tata kelola pemerintahan yang bersih, transparan, dan akuntabel. Dinas Komunikasi Informatika dan Persandian (Diskominfo) Kabupaten Sinjai melakukan optimalisasi pada website Pejabat Pengelola Informasi dan Dokumentasi (PPID) sebagai peningkatan dari sistem sebelumnya untuk memudahkan penginputan dan publikasi data informasi dari Organisasi Perangkat Daerah (OPD). Penelitian ini bertujuan untuk mengevaluasi </w:t>
       </w:r>
       <w:r>
         <w:rPr>
@@ -223,7 +223,7 @@
           <w:sz w:val="22"/>
           <w:szCs w:val="22"/>
         </w:rPr>
-        <w:t xml:space="preserve"> (ketergunaan) website PPID hasil pembaruan tersebut dari sudut pandang admin/operator OPD (Organisasi Perangkat Daerah) selaku kontributor data utama di lapangan. Evaluasi ini menggunakan pendekatan kombinasi kuantitatif deskriptif dan kualitatif. Data dikumpulkan melalui kuesioner terintegrasi kepada 28 responden admin pembantu PPID di lingkungan Pemerintah Kabupaten Sinjai. Hasil analisis kuantitatif menunjukkan peningkatan efisiensi yang sangat baik pada beberapa aspek kunci, antara lain kemudahan kategorisasi dokumen secara otomatis (100% respon positif) dan peningkatan produktivitas kerja secara signifikan dibandingkan website sebelumnya (100% respon setuju). Namun, pengujian usability ini berhasil mendeteksi kelemahan kritis pada aspek penanganan kesalahan (</w:t>
+        <w:t xml:space="preserve"> (kemudahan penggunaan) website PPID Kabupaten Sinjai berdasarkan persepsi para operator/admin OPD. Metode penelitian yang digunakan adalah deskriptif kualitatif dan kuantitatif melalui penyebaran kuesioner kepada 28 responden admin PPID pembantu di lingkungan OPD Kabupaten Sinjai. Hasil analisis data menunjukkan bahwa secara umum sistem ini sangat berhasil meningkatkan produktivitas pelaporan (100% responden setuju) dibandingkan sistem sebelumnya dan sangat membantu dalam pengkategorian dokumen secara otomatis (100% responden setuju). Namun, terdapat beberapa temuan kritis terkait aspek </w:t>
       </w:r>
       <w:r>
         <w:rPr>
@@ -232,6 +232,23 @@
           <w:szCs w:val="22"/>
           <w:i/>
         </w:rPr>
+        <w:t xml:space="preserve">usability</w:t>
+      </w:r>
+      <w:r>
+        <w:rPr>
+          <w:rFonts w:ascii="Arial" w:hAnsi="Arial"/>
+          <w:sz w:val="22"/>
+          <w:szCs w:val="22"/>
+        </w:rPr>
+        <w:t xml:space="preserve">, di antaranya adalah sistem penanganan kesalahan (</w:t>
+      </w:r>
+      <w:r>
+        <w:rPr>
+          <w:rFonts w:ascii="Arial" w:hAnsi="Arial"/>
+          <w:sz w:val="22"/>
+          <w:szCs w:val="22"/>
+          <w:i/>
+        </w:rPr>
         <w:t xml:space="preserve">error handling</w:t>
       </w:r>
       <w:r>
@@ -240,7 +257,7 @@
           <w:sz w:val="22"/>
           <w:szCs w:val="22"/>
         </w:rPr>
-        <w:t xml:space="preserve">), di mana 96,43% responden menilai kejelasan pesan kesalahan (</w:t>
+        <w:t xml:space="preserve">) yang dinilai belum jelas oleh 96,43% responden, serta antarmuka visual (</w:t>
       </w:r>
       <w:r>
         <w:rPr>
@@ -249,6 +266,23 @@
           <w:szCs w:val="22"/>
           <w:i/>
         </w:rPr>
+        <w:t xml:space="preserve">interface</w:t>
+      </w:r>
+      <w:r>
+        <w:rPr>
+          <w:rFonts w:ascii="Arial" w:hAnsi="Arial"/>
+          <w:sz w:val="22"/>
+          <w:szCs w:val="22"/>
+        </w:rPr>
+        <w:t xml:space="preserve">) yang masih membutuhkan perbaikan (50% menilai cukup/kurang). Rekomendasi utama dari penelitian ini adalah perlunya optimalisasi sistem pesan kesalahan (</w:t>
+      </w:r>
+      <w:r>
+        <w:rPr>
+          <w:rFonts w:ascii="Arial" w:hAnsi="Arial"/>
+          <w:sz w:val="22"/>
+          <w:szCs w:val="22"/>
+          <w:i/>
+        </w:rPr>
         <w:t xml:space="preserve">error message</w:t>
       </w:r>
       <w:r>
@@ -257,7 +291,7 @@
           <w:sz w:val="22"/>
           <w:szCs w:val="22"/>
         </w:rPr>
-        <w:t xml:space="preserve">) saat kegagalan input masih sangat kurang. Selain itu, aspek estetika visual antarmuka dashboard dinilai kurang optimal oleh 50% responden. Hasil penelitian ini memberikan rekomendasi konkret bagi pengembang untuk merancang sistem notifikasi error yang lebih komunikatif, mengimplementasikan dashboard monitoring kelengkapan dokumen mandiri bagi OPD, serta menambahkan fitur </w:t>
+        <w:t xml:space="preserve">), penyediaan fitur monitoring progres kelengkapan dokumen mandiri bagi admin OPD, serta usulan pengembangan fitur pengunggahan luring (</w:t>
       </w:r>
       <w:r>
         <w:rPr>
@@ -266,15 +300,15 @@
           <w:szCs w:val="22"/>
           <w:i/>
         </w:rPr>
-        <w:t xml:space="preserve">upload caching</w:t>
-      </w:r>
-      <w:r>
-        <w:rPr>
-          <w:rFonts w:ascii="Arial" w:hAnsi="Arial"/>
-          <w:sz w:val="22"/>
-          <w:szCs w:val="22"/>
-        </w:rPr>
-        <w:t xml:space="preserve"> (pengunggahan offline) untuk mengantisipasi ketidakstabilan jaringan internet di kantor-kantor daerah.</w:t>
+        <w:t xml:space="preserve">offline upload</w:t>
+      </w:r>
+      <w:r>
+        <w:rPr>
+          <w:rFonts w:ascii="Arial" w:hAnsi="Arial"/>
+          <w:sz w:val="22"/>
+          <w:szCs w:val="22"/>
+        </w:rPr>
+        <w:t xml:space="preserve">) sebagai rencana jangka panjang untuk mengatasi kendala kestabilan jaringan internet di daerah.</w:t>
       </w:r>
     </w:p>
     <w:p>
@@ -304,7 +338,7 @@
           <w:szCs w:val="22"/>
           <w:i/>
         </w:rPr>
-        <w:t xml:space="preserve">Public information disclosure is a key pillar in achieving clean, transparent, and accountable governance. The Department of Communication, Informatics, and Media (Diskominfo) of Sinjai Regency implemented an optimization and upgrade to the PPID (Information and Documentation Management Officer) website as an improvement from the previous web system which was deemed inefficient. This study aims to conduct an in-depth evaluation of the usability aspects of the upgraded PPID website from the perspective of OPD (Regional Government Agencies) admins/operators as the primary data contributors in the field. This evaluation uses a combined descriptive quantitative and qualitative approach. Data were collected through an integrated questionnaire distributed to 28 assistant PPID admin respondents within the Sinjai Regency Government. The results of the quantitative analysis showed excellent efficiency improvements in several key aspects, including the ease of automatic document categorization (100% positive response) and a significant increase in work productivity compared to the previous website (100% agreement). However, usability testing successfully detected a critical weakness in the error handling aspect, where 96.43% of respondents rated the clarity of error messages during input failure as very poor. In addition, the visual aesthetics of the dashboard interface were deemed less than optimal by 50% of respondents. The results of this study provide concrete recommendations for developers to design more communicative error notification systems, implement self-monitoring dashboards for document completeness for OPDs, and add an upload caching (offline upload) feature to anticipate internet connection instability in regional offices.</w:t>
+        <w:t xml:space="preserve">Public information disclosure is a key pillar in achieving clean, transparent, and accountable governance. The Department of Communication, Informatics, and Media (Diskominfo) of Sinjai Regency optimized the PPID (Information and Documentation Management Officer) website as an upgrade to the previous system to facilitate the entry and publication of information from regional government agencies (OPD). This study aims to evaluate the usability of the Sinjai Regency PPID website based on the perception of OPD operators/admins. The research method used is descriptive qualitative and quantitative by distributing questionnaires to 28 respondents of assistant PPID admins within the Sinjai Regency government. The results of the data analysis show that, in general, this system has successfully increased reporting productivity (100% of respondents agree) compared to the previous system and is highly helpful in automatic document categorization (100% of respondents agree). However, there are some critical findings related to usability aspects, including the error handling system, which was rated as unclear by 96.43% of respondents, and the visual interface, which still needs improvement (50% rated as average/poor). The main recommendations of this study are the need to optimize the error messaging system, provide a self-monitoring feature for document completeness progress for OPD admins, and proposing the future development of an offline upload feature as a long-term solution to overcome internet connection stability constraints in the region.</w:t>
       </w:r>
     </w:p>
     <w:p>
@@ -4984,7 +5018,7 @@
           <w:szCs w:val="22"/>
           <w:b/>
         </w:rPr>
-        <w:t xml:space="preserve">Mekanisme Cache Penyimpanan Sementara (Offline Mode Upload)</w:t>
+        <w:t xml:space="preserve">Usulan Pengembangan Mekanisme Cache Penyimpanan Sementara (Offline Mode Upload)</w:t>
       </w:r>
       <w:r>
         <w:rPr>
@@ -5006,7 +5040,7 @@
           <w:sz w:val="22"/>
           <w:szCs w:val="22"/>
         </w:rPr>
-        <w:t xml:space="preserve">Mengembangkan fitur penyimpanan data lokal sementara (</w:t>
+        <w:t xml:space="preserve">Sebagai rencana pengembangan jangka panjang yang diusulkan bagi pengembang sistem, disarankan untuk mengimplementasikan fitur penyimpanan data lokal sementara (</w:t>
       </w:r>
       <w:r>
         <w:rPr>
@@ -5023,7 +5057,7 @@
           <w:sz w:val="22"/>
           <w:szCs w:val="22"/>
         </w:rPr>
-        <w:t xml:space="preserve">) berbasis browser. Fitur ini memungkinkan operator tetap menginput data secara luring (</w:t>
+        <w:t xml:space="preserve">) berbasis browser. Rencana fitur masa depan ini dirancang agar operator tetap dapat menginput data secara luring (</w:t>
       </w:r>
       <w:r>
         <w:rPr>
@@ -5040,7 +5074,7 @@
           <w:sz w:val="22"/>
           <w:szCs w:val="22"/>
         </w:rPr>
-        <w:t xml:space="preserve">) saat internet terputus, dan data tersebut akan diunggah otomatis ke server ketika jaringan kembali stabil.</w:t>
+        <w:t xml:space="preserve">) terlebih dahulu saat internet terputus, dan data tersebut akan disinkronisasikan secara otomatis ke server pusat ketika koneksi kembali stabil.</w:t>
       </w:r>
     </w:p>
     <w:p>

</xml_diff>